<commit_message>
last commit before submission
</commit_message>
<xml_diff>
--- a/docs/reports/Phase 3_ Final Report.docx
+++ b/docs/reports/Phase 3_ Final Report.docx
@@ -4,21 +4,21 @@
   <w:body>
     <w:p>
       <w:pPr>
-        <w:pStyle w:val="1"/>
+        <w:pStyle w:val="Heading1"/>
       </w:pPr>
       <w:bookmarkStart w:id="0" w:name="_ev35oa4yw1jo" w:colFirst="0" w:colLast="0"/>
       <w:bookmarkEnd w:id="0"/>
     </w:p>
     <w:p>
       <w:pPr>
-        <w:pStyle w:val="1"/>
+        <w:pStyle w:val="Heading1"/>
       </w:pPr>
       <w:bookmarkStart w:id="1" w:name="_882mtzfo4q16" w:colFirst="0" w:colLast="0"/>
       <w:bookmarkEnd w:id="1"/>
     </w:p>
     <w:p>
       <w:pPr>
-        <w:pStyle w:val="1"/>
+        <w:pStyle w:val="Heading1"/>
       </w:pPr>
       <w:bookmarkStart w:id="2" w:name="_lnmwgwlnofzh" w:colFirst="0" w:colLast="0"/>
       <w:bookmarkEnd w:id="2"/>
@@ -28,7 +28,7 @@
     </w:p>
     <w:p>
       <w:pPr>
-        <w:pStyle w:val="1"/>
+        <w:pStyle w:val="Heading1"/>
       </w:pPr>
       <w:bookmarkStart w:id="3" w:name="_hi7u5y398c0r" w:colFirst="0" w:colLast="0"/>
       <w:bookmarkEnd w:id="3"/>
@@ -95,15 +95,7 @@
         <w:jc w:val="center"/>
       </w:pPr>
       <w:r>
-        <w:t xml:space="preserve">Yogita </w:t>
-      </w:r>
-      <w:proofErr w:type="spellStart"/>
-      <w:r>
-        <w:t>Mutyala</w:t>
-      </w:r>
-      <w:proofErr w:type="spellEnd"/>
-      <w:r>
-        <w:t xml:space="preserve"> </w:t>
+        <w:t xml:space="preserve">Yogita Mutyala </w:t>
       </w:r>
     </w:p>
     <w:p>
@@ -191,7 +183,7 @@
     </w:p>
     <w:p>
       <w:pPr>
-        <w:pStyle w:val="2"/>
+        <w:pStyle w:val="Heading2"/>
         <w:jc w:val="both"/>
       </w:pPr>
       <w:bookmarkStart w:id="4" w:name="_7oeq4kbbym8k" w:colFirst="0" w:colLast="0"/>
@@ -220,6 +212,15 @@
       </w:pPr>
       <w:r>
         <w:t>This project investigates whether a single PostgreSQL instance extended with Apache AGE can serve both purposes. The application, Hybrid-AML, implements two AML detection rules on a synthetic financial dataset. The first targets smurfing, where a large sum is broken into sub-threshold cash deposits funneled into one account before being wired out. The second targets circular trading, where funds move in a closed loop between related accounts. Both patterns are detected using two paths: native SQL and an equivalent Cypher query through AGE, allowing direct measurement of storage and execution tradeoffs.</w:t>
+      </w:r>
+      <w:r>
+        <w:t xml:space="preserve"> </w:t>
+      </w:r>
+      <w:r>
+        <w:t>PostgreSQL was chosen because it provides ACID-compliant relational storage, a mature query planner, flexible indexing, and strong extensibility</w:t>
+      </w:r>
+      <w:r>
+        <w:t>.</w:t>
       </w:r>
     </w:p>
     <w:p>
@@ -319,20 +320,13 @@
       <w:pPr>
         <w:jc w:val="both"/>
       </w:pPr>
-    </w:p>
-    <w:p>
-      <w:pPr>
-        <w:jc w:val="both"/>
-      </w:pPr>
-    </w:p>
-    <w:p>
-      <w:pPr>
-        <w:jc w:val="both"/>
-      </w:pPr>
-    </w:p>
-    <w:p>
-      <w:pPr>
-        <w:pStyle w:val="2"/>
+      <w:r>
+        <w:t>Beyond academic interest, this problem is highly relevant in real-world financial systems where regulatory compliance requires timely detection of suspicious activity. Institutions must balance accuracy, performance, and system complexity when analyzing large-scale transactional data. A unified system that reduces infrastructure overhead while supporting both relational integrity and graph-based pattern detection can significantly lower operational costs and simplify system architecture.</w:t>
+      </w:r>
+    </w:p>
+    <w:p>
+      <w:pPr>
+        <w:pStyle w:val="Heading2"/>
         <w:jc w:val="both"/>
       </w:pPr>
       <w:bookmarkStart w:id="5" w:name="_rao8mpcgkg3s" w:colFirst="0" w:colLast="0"/>
@@ -346,13 +340,16 @@
       <w:pPr>
         <w:jc w:val="both"/>
       </w:pPr>
-    </w:p>
-    <w:p>
-      <w:pPr>
-        <w:jc w:val="both"/>
-      </w:pPr>
-      <w:r>
-        <w:t>PostgreSQL is an open-source relational DBMS using heap-organized storage where table data lives in 8 KB pages as row versions called tuples. It supports typed columns, composite indexes, recursive queries, and a cost-based query planner. Concurrency is handled through MVCC, allowing readers and writers to operate simultaneously without blocking each other.</w:t>
+      <w:r>
+        <w:t xml:space="preserve">PostgreSQL is an open-source relational DBMS using heap-organized storage where table data </w:t>
+      </w:r>
+      <w:proofErr w:type="gramStart"/>
+      <w:r>
+        <w:t>lives</w:t>
+      </w:r>
+      <w:proofErr w:type="gramEnd"/>
+      <w:r>
+        <w:t xml:space="preserve"> in 8 KB pages as row versions called tuples. It supports typed columns, composite indexes, recursive queries, and a cost-based query planner. Concurrency is handled through MVCC, allowing readers and writers to operate simultaneously without blocking each other.</w:t>
       </w:r>
     </w:p>
     <w:p>
@@ -410,7 +407,7 @@
         <w:jc w:val="both"/>
       </w:pPr>
       <w:r>
-        <w:t xml:space="preserve">When a Cypher query is submitted, AGE parses </w:t>
+        <w:t xml:space="preserve">When a Cypher query is submitted, AGE translates </w:t>
       </w:r>
       <w:proofErr w:type="spellStart"/>
       <w:r>
@@ -418,7 +415,7 @@
       </w:r>
       <w:proofErr w:type="spellEnd"/>
       <w:r>
-        <w:t xml:space="preserve">, transforms it into PostgreSQL's internal query tree, and passes it to the standard planner and executor. The implementation is tested as a </w:t>
+        <w:t xml:space="preserve"> into PostgreSQL’s internal query tree and executes it through the standard planner and executor. The system runs in a </w:t>
       </w:r>
       <w:proofErr w:type="spellStart"/>
       <w:r>
@@ -426,28 +423,12 @@
       </w:r>
       <w:proofErr w:type="spellEnd"/>
       <w:r>
-        <w:t xml:space="preserve"> single-node PostgreSQL + Apache AGE environment using the </w:t>
-      </w:r>
-      <w:proofErr w:type="spellStart"/>
-      <w:r>
-        <w:t>hybrid_aml</w:t>
-      </w:r>
-      <w:proofErr w:type="spellEnd"/>
-      <w:r>
-        <w:t xml:space="preserve"> database, </w:t>
-      </w:r>
-      <w:proofErr w:type="spellStart"/>
-      <w:r>
-        <w:t>apache</w:t>
-      </w:r>
-      <w:proofErr w:type="spellEnd"/>
-      <w:r>
-        <w:t>-age container, and host port 5455. Unlike Neo4j, AGE does not use index-free adjacency; unlike MySQL, it supports graph syntax through PostgreSQL parser and planner integration.</w:t>
-      </w:r>
-    </w:p>
-    <w:p>
-      <w:pPr>
-        <w:pStyle w:val="2"/>
+        <w:t xml:space="preserve"> single-node environment. Unlike Neo4j, AGE does not use index-free adjacency, and unlike MySQL, it integrates graph queries directly into PostgreSQL’s parser and planner.</w:t>
+      </w:r>
+    </w:p>
+    <w:p>
+      <w:pPr>
+        <w:pStyle w:val="Heading2"/>
         <w:jc w:val="both"/>
       </w:pPr>
       <w:bookmarkStart w:id="6" w:name="_nfzk2vn5g6l9" w:colFirst="0" w:colLast="0"/>
@@ -458,7 +439,7 @@
     </w:p>
     <w:p>
       <w:pPr>
-        <w:pStyle w:val="3"/>
+        <w:pStyle w:val="Heading3"/>
         <w:jc w:val="both"/>
       </w:pPr>
       <w:bookmarkStart w:id="7" w:name="_wo0nebuna89c" w:colFirst="0" w:colLast="0"/>
@@ -569,11 +550,10 @@
         <w:rPr>
           <w:noProof/>
         </w:rPr>
-        <w:lastRenderedPageBreak/>
         <w:drawing>
-          <wp:inline distT="114300" distB="114300" distL="114300" distR="114300" wp14:anchorId="220802E9" wp14:editId="2864762B">
-            <wp:extent cx="3606800" cy="2857500"/>
-            <wp:effectExtent l="0" t="0" r="0" b="0"/>
+          <wp:inline distT="114300" distB="114300" distL="114300" distR="114300" wp14:anchorId="220802E9" wp14:editId="56FC6503">
+            <wp:extent cx="3482975" cy="2352675"/>
+            <wp:effectExtent l="0" t="0" r="3175" b="9525"/>
             <wp:docPr id="3" name="image2.jpg"/>
             <wp:cNvGraphicFramePr/>
             <a:graphic xmlns:a="http://schemas.openxmlformats.org/drawingml/2006/main">
@@ -583,22 +563,29 @@
                     <pic:cNvPr id="0" name="image2.jpg"/>
                     <pic:cNvPicPr preferRelativeResize="0"/>
                   </pic:nvPicPr>
-                  <pic:blipFill>
+                  <pic:blipFill rotWithShape="1">
                     <a:blip r:embed="rId7"/>
-                    <a:srcRect/>
+                    <a:srcRect l="352" t="5333" r="-352" b="667"/>
                     <a:stretch>
                       <a:fillRect/>
                     </a:stretch>
                   </pic:blipFill>
-                  <pic:spPr>
+                  <pic:spPr bwMode="auto">
                     <a:xfrm>
                       <a:off x="0" y="0"/>
-                      <a:ext cx="3606800" cy="2857500"/>
+                      <a:ext cx="3482975" cy="2352675"/>
                     </a:xfrm>
                     <a:prstGeom prst="rect">
                       <a:avLst/>
                     </a:prstGeom>
-                    <a:ln/>
+                    <a:ln>
+                      <a:noFill/>
+                    </a:ln>
+                    <a:extLst>
+                      <a:ext uri="{53640926-AAD7-44D8-BBD7-CCE9431645EC}">
+                        <a14:shadowObscured xmlns:a14="http://schemas.microsoft.com/office/drawing/2010/main"/>
+                      </a:ext>
+                    </a:extLst>
                   </pic:spPr>
                 </pic:pic>
               </a:graphicData>
@@ -620,17 +607,40 @@
           <w:sz w:val="18"/>
           <w:szCs w:val="18"/>
         </w:rPr>
-        <w:t>Figure 2: Relational schema showing customers, accounts, and transactions with foreign key relationships</w:t>
-      </w:r>
-    </w:p>
-    <w:p>
-      <w:pPr>
-        <w:pStyle w:val="3"/>
+        <w:t xml:space="preserve">Figure 2: Relational schema showing customers, accounts, and transactions with </w:t>
+      </w:r>
+      <w:proofErr w:type="gramStart"/>
+      <w:r>
+        <w:rPr>
+          <w:i/>
+          <w:iCs/>
+          <w:color w:val="555555"/>
+          <w:sz w:val="18"/>
+          <w:szCs w:val="18"/>
+        </w:rPr>
+        <w:t>foreign key</w:t>
+      </w:r>
+      <w:proofErr w:type="gramEnd"/>
+      <w:r>
+        <w:rPr>
+          <w:i/>
+          <w:iCs/>
+          <w:color w:val="555555"/>
+          <w:sz w:val="18"/>
+          <w:szCs w:val="18"/>
+        </w:rPr>
+        <w:t xml:space="preserve"> relationships</w:t>
+      </w:r>
+    </w:p>
+    <w:p>
+      <w:pPr>
+        <w:pStyle w:val="Heading3"/>
         <w:jc w:val="both"/>
       </w:pPr>
       <w:bookmarkStart w:id="8" w:name="_xi20o7d7t7qn" w:colFirst="0" w:colLast="0"/>
       <w:bookmarkEnd w:id="8"/>
       <w:r>
+        <w:lastRenderedPageBreak/>
         <w:t>Indexing</w:t>
       </w:r>
     </w:p>
@@ -710,13 +720,12 @@
     </w:p>
     <w:p>
       <w:pPr>
-        <w:pStyle w:val="3"/>
+        <w:pStyle w:val="Heading3"/>
         <w:jc w:val="both"/>
       </w:pPr>
       <w:bookmarkStart w:id="9" w:name="_ngnlevmllool" w:colFirst="0" w:colLast="0"/>
       <w:bookmarkEnd w:id="9"/>
       <w:r>
-        <w:lastRenderedPageBreak/>
         <w:t>Query Execution</w:t>
       </w:r>
     </w:p>
@@ -746,7 +755,7 @@
     </w:p>
     <w:p>
       <w:pPr>
-        <w:pStyle w:val="3"/>
+        <w:pStyle w:val="Heading3"/>
         <w:jc w:val="both"/>
       </w:pPr>
       <w:bookmarkStart w:id="10" w:name="_mno4xcyz9fa3" w:colFirst="0" w:colLast="0"/>
@@ -773,12 +782,13 @@
     </w:p>
     <w:p>
       <w:pPr>
-        <w:pStyle w:val="2"/>
+        <w:pStyle w:val="Heading2"/>
         <w:jc w:val="both"/>
       </w:pPr>
       <w:bookmarkStart w:id="11" w:name="_z0zbxho8gdax" w:colFirst="0" w:colLast="0"/>
       <w:bookmarkEnd w:id="11"/>
       <w:r>
+        <w:lastRenderedPageBreak/>
         <w:t>Application Design</w:t>
       </w:r>
     </w:p>
@@ -792,8 +802,8 @@
           <w:noProof/>
         </w:rPr>
         <w:drawing>
-          <wp:inline distT="114300" distB="114300" distL="114300" distR="114300" wp14:anchorId="31161B13" wp14:editId="38197E5F">
-            <wp:extent cx="4572000" cy="2578100"/>
+          <wp:inline distT="114300" distB="114300" distL="114300" distR="114300" wp14:anchorId="31161B13" wp14:editId="26846FCC">
+            <wp:extent cx="4572000" cy="2419350"/>
             <wp:effectExtent l="0" t="0" r="0" b="0"/>
             <wp:docPr id="6" name="image4.gif"/>
             <wp:cNvGraphicFramePr/>
@@ -804,22 +814,29 @@
                     <pic:cNvPr id="0" name="image4.gif"/>
                     <pic:cNvPicPr preferRelativeResize="0"/>
                   </pic:nvPicPr>
-                  <pic:blipFill>
+                  <pic:blipFill rotWithShape="1">
                     <a:blip r:embed="rId8"/>
-                    <a:srcRect/>
+                    <a:srcRect t="6158"/>
                     <a:stretch>
                       <a:fillRect/>
                     </a:stretch>
                   </pic:blipFill>
-                  <pic:spPr>
+                  <pic:spPr bwMode="auto">
                     <a:xfrm>
                       <a:off x="0" y="0"/>
-                      <a:ext cx="4572000" cy="2578100"/>
+                      <a:ext cx="4572000" cy="2419350"/>
                     </a:xfrm>
                     <a:prstGeom prst="rect">
                       <a:avLst/>
                     </a:prstGeom>
-                    <a:ln/>
+                    <a:ln>
+                      <a:noFill/>
+                    </a:ln>
+                    <a:extLst>
+                      <a:ext uri="{53640926-AAD7-44D8-BBD7-CCE9431645EC}">
+                        <a14:shadowObscured xmlns:a14="http://schemas.microsoft.com/office/drawing/2010/main"/>
+                      </a:ext>
+                    </a:extLst>
                   </pic:spPr>
                 </pic:pic>
               </a:graphicData>
@@ -851,7 +868,6 @@
         <w:t>Figure 3: Hybrid-AML prototype architecture connecting synthetic data, relational tables, and AGE graph projection</w:t>
       </w:r>
     </w:p>
-    <w:p/>
     <w:p>
       <w:pPr>
         <w:jc w:val="both"/>
@@ -864,13 +880,8 @@
       <w:pPr>
         <w:jc w:val="both"/>
       </w:pPr>
-    </w:p>
-    <w:p>
-      <w:pPr>
-        <w:jc w:val="both"/>
-      </w:pPr>
-      <w:r>
-        <w:t>The six components are: (1) a Python generator producing 324 customers, 369 accounts, and 1,896 transactions with nine smurfing and nine circular trading scenarios; (2) relational schema and loader scripts; (3) two AGE graph projections; (4) five SQL/Cypher detection files; (5) a live demo runner; and (6) a benchmark script that runs each query 20 times with EXPLAIN ANALYZE BUFFERS and writes artifacts to docs/reports/.</w:t>
+      <w:r>
+        <w:t>The system consists of a synthetic data generator, relational schema and loaders, two AGE graph projections, SQL and Cypher detection queries, a demo runner, and a benchmarking script that executes each query 20 times and records EXPLAIN ANALYZE results.</w:t>
       </w:r>
     </w:p>
     <w:p>
@@ -881,7 +892,6 @@
         <w:rPr>
           <w:noProof/>
         </w:rPr>
-        <w:lastRenderedPageBreak/>
         <w:drawing>
           <wp:inline distT="114300" distB="114300" distL="114300" distR="114300" wp14:anchorId="4511CD84" wp14:editId="570613F9">
             <wp:extent cx="5943600" cy="3962400"/>
@@ -937,12 +947,13 @@
     </w:p>
     <w:p>
       <w:pPr>
-        <w:pStyle w:val="3"/>
+        <w:pStyle w:val="Heading3"/>
         <w:jc w:val="both"/>
       </w:pPr>
       <w:bookmarkStart w:id="12" w:name="_aqqdlajwmwp3" w:colFirst="0" w:colLast="0"/>
       <w:bookmarkEnd w:id="12"/>
       <w:r>
+        <w:lastRenderedPageBreak/>
         <w:t>Detection Rules</w:t>
       </w:r>
     </w:p>
@@ -952,6 +963,100 @@
       </w:pPr>
       <w:r>
         <w:t>Smurfing: flags any account receiving five or more cash deposits each below USD 10,000 on the same day totaling at least USD 45,000, followed by an outbound transfer of at least 70% of that total within 24 hours. Representative scenario: ACC-AML-HUB-001 receives six deposits totaling USD 56,800, then wires USD 54,900 to ACC-SHELL-001 on the same day.</w:t>
+      </w:r>
+    </w:p>
+    <w:p>
+      <w:pPr>
+        <w:jc w:val="center"/>
+      </w:pPr>
+      <w:r>
+        <w:drawing>
+          <wp:inline distT="0" distB="0" distL="0" distR="0" wp14:anchorId="5910EE10" wp14:editId="771C42F0">
+            <wp:extent cx="3272559" cy="1866545"/>
+            <wp:effectExtent l="0" t="0" r="4445" b="635"/>
+            <wp:docPr id="56" name="그림 55">
+              <a:extLst xmlns:a="http://schemas.openxmlformats.org/drawingml/2006/main">
+                <a:ext uri="{FF2B5EF4-FFF2-40B4-BE49-F238E27FC236}">
+                  <a16:creationId xmlns:a16="http://schemas.microsoft.com/office/drawing/2014/main" id="{24F60AD0-3B3C-4C41-4A16-A603F51651C8}"/>
+                </a:ext>
+              </a:extLst>
+            </wp:docPr>
+            <wp:cNvGraphicFramePr>
+              <a:graphicFrameLocks xmlns:a="http://schemas.openxmlformats.org/drawingml/2006/main" noChangeAspect="1"/>
+            </wp:cNvGraphicFramePr>
+            <a:graphic xmlns:a="http://schemas.openxmlformats.org/drawingml/2006/main">
+              <a:graphicData uri="http://schemas.openxmlformats.org/drawingml/2006/picture">
+                <pic:pic xmlns:pic="http://schemas.openxmlformats.org/drawingml/2006/picture">
+                  <pic:nvPicPr>
+                    <pic:cNvPr id="56" name="그림 55">
+                      <a:extLst>
+                        <a:ext uri="{FF2B5EF4-FFF2-40B4-BE49-F238E27FC236}">
+                          <a16:creationId xmlns:a16="http://schemas.microsoft.com/office/drawing/2014/main" id="{24F60AD0-3B3C-4C41-4A16-A603F51651C8}"/>
+                        </a:ext>
+                      </a:extLst>
+                    </pic:cNvPr>
+                    <pic:cNvPicPr>
+                      <a:picLocks noChangeAspect="1"/>
+                    </pic:cNvPicPr>
+                  </pic:nvPicPr>
+                  <pic:blipFill rotWithShape="1">
+                    <a:blip r:embed="rId10"/>
+                    <a:srcRect t="18590" b="6824"/>
+                    <a:stretch>
+                      <a:fillRect/>
+                    </a:stretch>
+                  </pic:blipFill>
+                  <pic:spPr bwMode="auto">
+                    <a:xfrm>
+                      <a:off x="0" y="0"/>
+                      <a:ext cx="3282863" cy="1872422"/>
+                    </a:xfrm>
+                    <a:prstGeom prst="rect">
+                      <a:avLst/>
+                    </a:prstGeom>
+                    <a:ln>
+                      <a:noFill/>
+                    </a:ln>
+                    <a:extLst>
+                      <a:ext uri="{53640926-AAD7-44D8-BBD7-CCE9431645EC}">
+                        <a14:shadowObscured xmlns:a14="http://schemas.microsoft.com/office/drawing/2010/main"/>
+                      </a:ext>
+                    </a:extLst>
+                  </pic:spPr>
+                </pic:pic>
+              </a:graphicData>
+            </a:graphic>
+          </wp:inline>
+        </w:drawing>
+      </w:r>
+    </w:p>
+    <w:p>
+      <w:pPr>
+        <w:spacing w:before="40" w:after="120"/>
+        <w:jc w:val="center"/>
+      </w:pPr>
+      <w:r>
+        <w:rPr>
+          <w:i/>
+          <w:iCs/>
+          <w:color w:val="555555"/>
+          <w:sz w:val="18"/>
+          <w:szCs w:val="18"/>
+        </w:rPr>
+        <w:t>Figure 5</w:t>
+      </w:r>
+      <w:r>
+        <w:t xml:space="preserve"> </w:t>
+      </w:r>
+      <w:r>
+        <w:rPr>
+          <w:i/>
+          <w:iCs/>
+          <w:color w:val="555555"/>
+          <w:sz w:val="18"/>
+          <w:szCs w:val="18"/>
+        </w:rPr>
+        <w:t>Representative smurfing funnel showing six sub-threshold cash deposits converging on ACC-AML-HUB-001 followed by a same-day outbound wire to ACC-SHELL-001</w:t>
       </w:r>
     </w:p>
     <w:p>
@@ -976,11 +1081,10 @@
         <w:rPr>
           <w:noProof/>
         </w:rPr>
-        <w:lastRenderedPageBreak/>
         <w:drawing>
-          <wp:inline distT="114300" distB="114300" distL="114300" distR="114300" wp14:anchorId="1F391B30" wp14:editId="6CD4D135">
-            <wp:extent cx="3060700" cy="2667000"/>
-            <wp:effectExtent l="0" t="0" r="0" b="0"/>
+          <wp:inline distT="114300" distB="114300" distL="114300" distR="114300" wp14:anchorId="1F391B30" wp14:editId="6493C09C">
+            <wp:extent cx="2355850" cy="1562100"/>
+            <wp:effectExtent l="0" t="0" r="6350" b="0"/>
             <wp:docPr id="1" name="image6.gif"/>
             <wp:cNvGraphicFramePr/>
             <a:graphic xmlns:a="http://schemas.openxmlformats.org/drawingml/2006/main">
@@ -990,22 +1094,29 @@
                     <pic:cNvPr id="0" name="image6.gif"/>
                     <pic:cNvPicPr preferRelativeResize="0"/>
                   </pic:nvPicPr>
-                  <pic:blipFill>
-                    <a:blip r:embed="rId10"/>
-                    <a:srcRect/>
+                  <pic:blipFill rotWithShape="1">
+                    <a:blip r:embed="rId11"/>
+                    <a:srcRect t="4047" b="16190"/>
                     <a:stretch>
                       <a:fillRect/>
                     </a:stretch>
                   </pic:blipFill>
-                  <pic:spPr>
+                  <pic:spPr bwMode="auto">
                     <a:xfrm>
                       <a:off x="0" y="0"/>
-                      <a:ext cx="3060700" cy="2667000"/>
+                      <a:ext cx="2355850" cy="1562100"/>
                     </a:xfrm>
                     <a:prstGeom prst="rect">
                       <a:avLst/>
                     </a:prstGeom>
-                    <a:ln/>
+                    <a:ln>
+                      <a:noFill/>
+                    </a:ln>
+                    <a:extLst>
+                      <a:ext uri="{53640926-AAD7-44D8-BBD7-CCE9431645EC}">
+                        <a14:shadowObscured xmlns:a14="http://schemas.microsoft.com/office/drawing/2010/main"/>
+                      </a:ext>
+                    </a:extLst>
                   </pic:spPr>
                 </pic:pic>
               </a:graphicData>
@@ -1027,115 +1138,144 @@
           <w:sz w:val="18"/>
           <w:szCs w:val="18"/>
         </w:rPr>
-        <w:t>Figure 5: Circular trading scenario showing the A -&gt; B -&gt; C -&gt; A fund flow loop within 6 hours</w:t>
-      </w:r>
-    </w:p>
-    <w:p>
-      <w:pPr>
-        <w:pStyle w:val="2"/>
-        <w:jc w:val="both"/>
-      </w:pPr>
-      <w:bookmarkStart w:id="13" w:name="_7xkv46q517iq" w:colFirst="0" w:colLast="0"/>
+        <w:t xml:space="preserve">Figure </w:t>
+      </w:r>
+      <w:r>
+        <w:rPr>
+          <w:i/>
+          <w:iCs/>
+          <w:color w:val="555555"/>
+          <w:sz w:val="18"/>
+          <w:szCs w:val="18"/>
+        </w:rPr>
+        <w:t>6</w:t>
+      </w:r>
+      <w:r>
+        <w:rPr>
+          <w:i/>
+          <w:iCs/>
+          <w:color w:val="555555"/>
+          <w:sz w:val="18"/>
+          <w:szCs w:val="18"/>
+        </w:rPr>
+        <w:t>: Circular trading scenario showing the A -&gt; B -&gt; C -&gt; A fund flow loop within 6 hours</w:t>
+      </w:r>
+    </w:p>
+    <w:p>
+      <w:r>
+        <w:t>From a user perspective, the system is designed to be simple and reproducible. Users interact with the application through command-line scripts that automate data generation, database setup, and query execution. This design ensures that even users without deep database expertise can reproduce the results, run fraud detection queries, and observe system behavior with minimal setup effort.</w:t>
+      </w:r>
+    </w:p>
+    <w:p>
+      <w:pPr>
+        <w:pStyle w:val="Heading2"/>
+        <w:jc w:val="both"/>
+      </w:pPr>
+      <w:r>
+        <w:t>Mapping Internals to Application Behavior</w:t>
+      </w:r>
+    </w:p>
+    <w:p>
+      <w:pPr>
+        <w:pStyle w:val="Heading3"/>
+        <w:jc w:val="both"/>
+      </w:pPr>
+      <w:bookmarkStart w:id="13" w:name="_1axwp1bkft7k" w:colFirst="0" w:colLast="0"/>
       <w:bookmarkEnd w:id="13"/>
       <w:r>
-        <w:t>Mapping Internals to Application Behavior</w:t>
-      </w:r>
-    </w:p>
-    <w:p>
-      <w:pPr>
-        <w:pStyle w:val="3"/>
-        <w:jc w:val="both"/>
-      </w:pPr>
-      <w:bookmarkStart w:id="14" w:name="_1axwp1bkft7k" w:colFirst="0" w:colLast="0"/>
+        <w:t>Operation 1: Smurfing Detection via Relational SQL (0.443ms, 169 buffers)</w:t>
+      </w:r>
+    </w:p>
+    <w:p>
+      <w:pPr>
+        <w:jc w:val="both"/>
+      </w:pPr>
+      <w:r>
+        <w:t xml:space="preserve">The query begins with a sequential scan over all transactions to isolate cash deposits, since no index combines </w:t>
+      </w:r>
+      <w:proofErr w:type="spellStart"/>
+      <w:r>
+        <w:t>tx_type</w:t>
+      </w:r>
+      <w:proofErr w:type="spellEnd"/>
+      <w:r>
+        <w:t xml:space="preserve"> and channel. A </w:t>
+      </w:r>
+      <w:proofErr w:type="spellStart"/>
+      <w:r>
+        <w:t>GroupAggregate</w:t>
+      </w:r>
+      <w:proofErr w:type="spellEnd"/>
+      <w:r>
+        <w:t xml:space="preserve"> then filters and retains only the suspicious clusters that meet the threshold criteria.</w:t>
+      </w:r>
+      <w:r>
+        <w:t xml:space="preserve"> </w:t>
+      </w:r>
+      <w:r>
+        <w:t xml:space="preserve">For each cluster, an index scan on </w:t>
+      </w:r>
+      <w:proofErr w:type="spellStart"/>
+      <w:r>
+        <w:t>idx_transactions_from_account_time</w:t>
+      </w:r>
+      <w:proofErr w:type="spellEnd"/>
+      <w:r>
+        <w:t xml:space="preserve"> uses a composite B-tree range scan to find outbound transfers within the 24-hour window, performing 9 index searches. Four nested loops join with </w:t>
+      </w:r>
+      <w:proofErr w:type="spellStart"/>
+      <w:r>
+        <w:t>accounts_pkey</w:t>
+      </w:r>
+      <w:proofErr w:type="spellEnd"/>
+      <w:r>
+        <w:t xml:space="preserve"> and </w:t>
+      </w:r>
+      <w:proofErr w:type="spellStart"/>
+      <w:r>
+        <w:t>customers_pkey</w:t>
+      </w:r>
+      <w:proofErr w:type="spellEnd"/>
+      <w:r>
+        <w:t xml:space="preserve"> to resolve customer names. Total: 0.443ms median, 169 shared buffers.</w:t>
+      </w:r>
+    </w:p>
+    <w:p>
+      <w:pPr>
+        <w:jc w:val="both"/>
+      </w:pPr>
+    </w:p>
+    <w:p>
+      <w:pPr>
+        <w:jc w:val="both"/>
+      </w:pPr>
+      <w:r>
+        <w:t>Why it matters: the composite index on (</w:t>
+      </w:r>
+      <w:proofErr w:type="spellStart"/>
+      <w:r>
+        <w:t>from_account_id</w:t>
+      </w:r>
+      <w:proofErr w:type="spellEnd"/>
+      <w:r>
+        <w:t xml:space="preserve">, </w:t>
+      </w:r>
+      <w:proofErr w:type="spellStart"/>
+      <w:r>
+        <w:t>tx_time</w:t>
+      </w:r>
+      <w:proofErr w:type="spellEnd"/>
+      <w:r>
+        <w:t>) reduces 9 potential full table scans to 9 direct B-tree lookups. Without it, the outbound transfer lookup would degrade linearly with dataset size.</w:t>
+      </w:r>
+    </w:p>
+    <w:p>
+      <w:pPr>
+        <w:pStyle w:val="Heading3"/>
+        <w:jc w:val="both"/>
+      </w:pPr>
+      <w:bookmarkStart w:id="14" w:name="_n9o7a65hhz54" w:colFirst="0" w:colLast="0"/>
       <w:bookmarkEnd w:id="14"/>
-      <w:r>
-        <w:t>Operation 1: Smurfing Detection via Relational SQL (0.443ms, 169 buffers)</w:t>
-      </w:r>
-    </w:p>
-    <w:p>
-      <w:pPr>
-        <w:jc w:val="both"/>
-      </w:pPr>
-      <w:r>
-        <w:t xml:space="preserve">The query begins with a sequential scan on the public. transactions reading all 1,896 rows to find 105 cash deposits, filtering out 1,791 rows. A sequential scan is chosen because no index combines </w:t>
-      </w:r>
-      <w:proofErr w:type="spellStart"/>
-      <w:r>
-        <w:t>tx_type</w:t>
-      </w:r>
-      <w:proofErr w:type="spellEnd"/>
-      <w:r>
-        <w:t xml:space="preserve"> and channel. A </w:t>
-      </w:r>
-      <w:proofErr w:type="spellStart"/>
-      <w:r>
-        <w:t>GroupAggregate</w:t>
-      </w:r>
-      <w:proofErr w:type="spellEnd"/>
-      <w:r>
-        <w:t xml:space="preserve"> groups by beneficiary account and day, removing 51 groups below the threshold and keeping 9 suspicious clusters. For each cluster, an index scan on </w:t>
-      </w:r>
-      <w:proofErr w:type="spellStart"/>
-      <w:r>
-        <w:t>idx_transactions_from_account_time</w:t>
-      </w:r>
-      <w:proofErr w:type="spellEnd"/>
-      <w:r>
-        <w:t xml:space="preserve"> uses a composite B-tree range scan to find outbound transfers within the 24-hour window, performing 9 index searches. Four nested loops join with </w:t>
-      </w:r>
-      <w:proofErr w:type="spellStart"/>
-      <w:r>
-        <w:t>accounts_pkey</w:t>
-      </w:r>
-      <w:proofErr w:type="spellEnd"/>
-      <w:r>
-        <w:t xml:space="preserve"> and </w:t>
-      </w:r>
-      <w:proofErr w:type="spellStart"/>
-      <w:r>
-        <w:t>customers_pkey</w:t>
-      </w:r>
-      <w:proofErr w:type="spellEnd"/>
-      <w:r>
-        <w:t xml:space="preserve"> to resolve customer names. Total: 0.443ms median, 169 shared buffers.</w:t>
-      </w:r>
-    </w:p>
-    <w:p>
-      <w:pPr>
-        <w:jc w:val="both"/>
-      </w:pPr>
-    </w:p>
-    <w:p>
-      <w:pPr>
-        <w:jc w:val="both"/>
-      </w:pPr>
-      <w:r>
-        <w:t>Why it matters: the composite index on (</w:t>
-      </w:r>
-      <w:proofErr w:type="spellStart"/>
-      <w:r>
-        <w:t>from_account_id</w:t>
-      </w:r>
-      <w:proofErr w:type="spellEnd"/>
-      <w:r>
-        <w:t xml:space="preserve">, </w:t>
-      </w:r>
-      <w:proofErr w:type="spellStart"/>
-      <w:r>
-        <w:t>tx_time</w:t>
-      </w:r>
-      <w:proofErr w:type="spellEnd"/>
-      <w:r>
-        <w:t>) reduces 9 potential full table scans to 9 direct B-tree lookups. Without it, the outbound transfer lookup would degrade linearly with dataset size.</w:t>
-      </w:r>
-    </w:p>
-    <w:p>
-      <w:pPr>
-        <w:pStyle w:val="3"/>
-        <w:jc w:val="both"/>
-      </w:pPr>
-      <w:bookmarkStart w:id="15" w:name="_n9o7a65hhz54" w:colFirst="0" w:colLast="0"/>
-      <w:bookmarkEnd w:id="15"/>
       <w:r>
         <w:t>Operation 2: Smurfing Detection via Apache AGE (2.503ms, 175 buffers)</w:t>
       </w:r>
@@ -1190,69 +1330,66 @@
     </w:p>
     <w:p>
       <w:pPr>
-        <w:pStyle w:val="3"/>
-        <w:jc w:val="both"/>
-      </w:pPr>
-      <w:bookmarkStart w:id="16" w:name="_wq7tzk4x833l" w:colFirst="0" w:colLast="0"/>
+        <w:pStyle w:val="Heading3"/>
+        <w:jc w:val="both"/>
+      </w:pPr>
+      <w:bookmarkStart w:id="15" w:name="_wq7tzk4x833l" w:colFirst="0" w:colLast="0"/>
+      <w:bookmarkEnd w:id="15"/>
+      <w:r>
+        <w:t>Operation 3: Circular Trading Detection via Recursive SQL (1.303ms, 31 buffers)</w:t>
+      </w:r>
+    </w:p>
+    <w:p>
+      <w:r>
+        <w:t>The query materializes transfer edges into an in-memory CTE and uses a recursive union with hash joins to construct 3-hop paths under time and uniqueness constraints, producing the final set of closed cycles.</w:t>
+      </w:r>
+      <w:r>
+        <w:t xml:space="preserve"> </w:t>
+      </w:r>
+      <w:r>
+        <w:t>Total: 1.303ms median, touching only 31 shared buffers because all computation runs against the in-memory CTE after the initial scan.</w:t>
+      </w:r>
+    </w:p>
+    <w:p/>
+    <w:p>
+      <w:r>
+        <w:t>Why it matters: for bounded 3-hop traversal on a dataset that fits in memory, CTE materialization outperforms index-driven graph traversal because the cost is paid once and amortized across all recursive steps.</w:t>
+      </w:r>
+    </w:p>
+    <w:p>
+      <w:pPr>
+        <w:pStyle w:val="Heading3"/>
+        <w:jc w:val="both"/>
+      </w:pPr>
+      <w:bookmarkStart w:id="16" w:name="_a2dkpasii3kh" w:colFirst="0" w:colLast="0"/>
       <w:bookmarkEnd w:id="16"/>
       <w:r>
-        <w:lastRenderedPageBreak/>
-        <w:t>Operation 3: Circular Trading Detection via Recursive SQL (1.303ms, 31 buffers)</w:t>
-      </w:r>
-    </w:p>
-    <w:p>
-      <w:r>
-        <w:t>The query materializes all 792 transfer edges into an in-memory CTE (78 KB) with a single sequential scan. A WITH RECURSIVE union grows 3-hop paths through hash joins on the in-memory CTE, enforcing a 6-hour window and no repeated accounts or transactions. A final CTE scan keeps 9 closed cycles. Total: 1.303ms median, touching only 31 shared buffers because all computation runs against the in-memory CTE after the initial scan.</w:t>
-      </w:r>
-    </w:p>
-    <w:p/>
-    <w:p>
-      <w:r>
-        <w:t>Why it matters: for bounded 3-hop traversal on a dataset that fits in memory, CTE materialization outperforms index-driven graph traversal because the cost is paid once and amortized across all recursive steps.</w:t>
-      </w:r>
-    </w:p>
-    <w:p>
-      <w:pPr>
-        <w:pStyle w:val="3"/>
-        <w:jc w:val="both"/>
-      </w:pPr>
-      <w:bookmarkStart w:id="17" w:name="_a2dkpasii3kh" w:colFirst="0" w:colLast="0"/>
+        <w:t xml:space="preserve">Operation 4: Circular Trading Detection via Apache AGE Cypher Baseline (6.97ms, 10,648 buffers) </w:t>
+      </w:r>
+    </w:p>
+    <w:p>
+      <w:pPr>
+        <w:jc w:val="both"/>
+      </w:pPr>
+      <w:r>
+        <w:t xml:space="preserve">AGE translates the Cypher MATCH pattern into three separate TRANSFER table scans, one per hop, stitched by hash joins and nested loops. </w:t>
+      </w:r>
+      <w:proofErr w:type="spellStart"/>
+      <w:r>
+        <w:t>TRANSFER_start_id_idx</w:t>
+      </w:r>
+      <w:proofErr w:type="spellEnd"/>
+      <w:r>
+        <w:t xml:space="preserve"> performs 792 index searches for hop 1 and 477 for hop 2. Agtype extraction applies to every edge property at every hop. _ag_enforce_edge_uniqueness3 adds a filter on each edge. Result: 6.97ms median, 10,648 shared buffers, approximately 5.4x slower than recursive SQL.</w:t>
+      </w:r>
+    </w:p>
+    <w:p>
+      <w:pPr>
+        <w:pStyle w:val="Heading3"/>
+        <w:jc w:val="both"/>
+      </w:pPr>
+      <w:bookmarkStart w:id="17" w:name="_rtk4e8jsd7e5" w:colFirst="0" w:colLast="0"/>
       <w:bookmarkEnd w:id="17"/>
-      <w:r>
-        <w:t xml:space="preserve">Operation 4: Circular Trading Detection via Apache AGE Cypher Baseline (6.97ms, 10,648 buffers) </w:t>
-      </w:r>
-    </w:p>
-    <w:p>
-      <w:pPr>
-        <w:jc w:val="both"/>
-      </w:pPr>
-      <w:r>
-        <w:t xml:space="preserve">AGE translates the Cypher MATCH pattern into three separate TRANSFER table scans, one per hop, stitched by hash joins and nested loops. </w:t>
-      </w:r>
-      <w:proofErr w:type="spellStart"/>
-      <w:r>
-        <w:t>TRANSFER_start_id_idx</w:t>
-      </w:r>
-      <w:proofErr w:type="spellEnd"/>
-      <w:r>
-        <w:t xml:space="preserve"> performs 792 index searches for hop 1 and 477 for hop 2. </w:t>
-      </w:r>
-      <w:proofErr w:type="spellStart"/>
-      <w:r>
-        <w:t>Agtype</w:t>
-      </w:r>
-      <w:proofErr w:type="spellEnd"/>
-      <w:r>
-        <w:t xml:space="preserve"> extraction applies to every edge property at every hop. _ag_enforce_edge_uniqueness3 adds a filter on each edge. Result: 6.97ms median, 10,648 shared buffers, approximately 5.4x slower than recursive SQL.</w:t>
-      </w:r>
-    </w:p>
-    <w:p>
-      <w:pPr>
-        <w:pStyle w:val="3"/>
-        <w:jc w:val="both"/>
-      </w:pPr>
-      <w:bookmarkStart w:id="18" w:name="_rtk4e8jsd7e5" w:colFirst="0" w:colLast="0"/>
-      <w:bookmarkEnd w:id="18"/>
       <w:r>
         <w:t>Operation 5: Circular Trading Detection via Tuned Cypher (2.586ms, 155 buffers)</w:t>
       </w:r>
@@ -1289,7 +1426,7 @@
     <w:p/>
     <w:tbl>
       <w:tblPr>
-        <w:tblStyle w:val="a5"/>
+        <w:tblStyle w:val="a"/>
         <w:tblW w:w="8595" w:type="dxa"/>
         <w:jc w:val="center"/>
         <w:tblInd w:w="0" w:type="dxa"/>
@@ -1785,6 +1922,7 @@
                 <w:sz w:val="19"/>
                 <w:szCs w:val="19"/>
               </w:rPr>
+              <w:lastRenderedPageBreak/>
               <w:t>Cycle Recursive SQL</w:t>
             </w:r>
           </w:p>
@@ -2187,16 +2325,27 @@
         <w:t>Table 1: Summary of internal behavior and measured performance for all five detection operations</w:t>
       </w:r>
     </w:p>
-    <w:p/>
-    <w:p>
-      <w:pPr>
-        <w:pStyle w:val="2"/>
-        <w:jc w:val="both"/>
-      </w:pPr>
-      <w:bookmarkStart w:id="19" w:name="_8wrizswjlc3z" w:colFirst="0" w:colLast="0"/>
-      <w:bookmarkEnd w:id="19"/>
-      <w:r>
-        <w:lastRenderedPageBreak/>
+    <w:p>
+      <w:bookmarkStart w:id="18" w:name="_8wrizswjlc3z" w:colFirst="0" w:colLast="0"/>
+      <w:bookmarkEnd w:id="18"/>
+      <w:r>
+        <w:t xml:space="preserve">In summary, the results demonstrate that relational SQL consistently outperforms graph-based queries in this workload due to lower overhead in data access and execution. While Apache AGE enables expressive graph queries, the additional costs of </w:t>
+      </w:r>
+      <w:proofErr w:type="spellStart"/>
+      <w:r>
+        <w:t>agtype</w:t>
+      </w:r>
+      <w:proofErr w:type="spellEnd"/>
+      <w:r>
+        <w:t xml:space="preserve"> extraction, vertex binding, and repeated index traversal introduce measurable performance penalties compared to optimized relational approaches.</w:t>
+      </w:r>
+    </w:p>
+    <w:p>
+      <w:pPr>
+        <w:pStyle w:val="Heading2"/>
+        <w:jc w:val="both"/>
+      </w:pPr>
+      <w:r>
         <w:t>Comparison with MySQL and MongoDB</w:t>
       </w:r>
     </w:p>
@@ -2206,15 +2355,13 @@
         <w:jc w:val="both"/>
       </w:pPr>
       <w:r>
-        <w:t>This comparison is architectural rather than benchmarked. PostgreSQL + AGE fits this workload because it combines relational integrity with bounded graph traversal. MySQL is stronger for conventional relational OLTP without graph query requirements, while MongoDB is strongest for flexible document storage and sharded document workloads.</w:t>
-      </w:r>
-    </w:p>
-    <w:p>
-      <w:pPr>
-        <w:pStyle w:val="3"/>
-      </w:pPr>
-      <w:bookmarkStart w:id="20" w:name="_6bhr6jrai1sw" w:colFirst="0" w:colLast="0"/>
-      <w:bookmarkEnd w:id="20"/>
+        <w:t>This comparison is architectural rather than benchmarked. PostgreSQL with AGE supports hybrid relational and graph workloads, while MySQL is optimized for traditional OLTP and MongoDB for flexible document storage.</w:t>
+      </w:r>
+    </w:p>
+    <w:p>
+      <w:pPr>
+        <w:pStyle w:val="Heading3"/>
+      </w:pPr>
       <w:r>
         <w:t>vs MySQL</w:t>
       </w:r>
@@ -2254,13 +2401,13 @@
     </w:p>
     <w:p>
       <w:pPr>
-        <w:pStyle w:val="3"/>
+        <w:pStyle w:val="Heading3"/>
         <w:keepNext w:val="0"/>
         <w:keepLines w:val="0"/>
         <w:jc w:val="both"/>
       </w:pPr>
-      <w:bookmarkStart w:id="21" w:name="_1w182qwylhl7" w:colFirst="0" w:colLast="0"/>
-      <w:bookmarkEnd w:id="21"/>
+      <w:bookmarkStart w:id="19" w:name="_1w182qwylhl7" w:colFirst="0" w:colLast="0"/>
+      <w:bookmarkEnd w:id="19"/>
       <w:r>
         <w:t>vs MongoDB</w:t>
       </w:r>
@@ -2287,13 +2434,10 @@
         <w:spacing w:before="60" w:after="60"/>
         <w:jc w:val="both"/>
       </w:pPr>
-      <w:r>
-        <w:t xml:space="preserve"> </w:t>
-      </w:r>
     </w:p>
     <w:tbl>
       <w:tblPr>
-        <w:tblStyle w:val="a6"/>
+        <w:tblStyle w:val="a0"/>
         <w:tblW w:w="8340" w:type="dxa"/>
         <w:jc w:val="center"/>
         <w:tblInd w:w="0" w:type="dxa"/>
@@ -2516,7 +2660,6 @@
           </w:tcPr>
           <w:p>
             <w:pPr>
-              <w:jc w:val="both"/>
               <w:rPr>
                 <w:sz w:val="19"/>
                 <w:szCs w:val="19"/>
@@ -2558,7 +2701,6 @@
           </w:tcPr>
           <w:p>
             <w:pPr>
-              <w:jc w:val="both"/>
               <w:rPr>
                 <w:sz w:val="19"/>
                 <w:szCs w:val="19"/>
@@ -2607,7 +2749,6 @@
           </w:tcPr>
           <w:p>
             <w:pPr>
-              <w:jc w:val="both"/>
               <w:rPr>
                 <w:sz w:val="19"/>
                 <w:szCs w:val="19"/>
@@ -2679,7 +2820,6 @@
           </w:tcPr>
           <w:p>
             <w:pPr>
-              <w:jc w:val="both"/>
               <w:rPr>
                 <w:sz w:val="19"/>
                 <w:szCs w:val="19"/>
@@ -2712,7 +2852,6 @@
           </w:tcPr>
           <w:p>
             <w:pPr>
-              <w:jc w:val="both"/>
               <w:rPr>
                 <w:sz w:val="19"/>
                 <w:szCs w:val="19"/>
@@ -2754,7 +2893,6 @@
           </w:tcPr>
           <w:p>
             <w:pPr>
-              <w:jc w:val="both"/>
               <w:rPr>
                 <w:sz w:val="19"/>
                 <w:szCs w:val="19"/>
@@ -2826,7 +2964,6 @@
           </w:tcPr>
           <w:p>
             <w:pPr>
-              <w:jc w:val="both"/>
               <w:rPr>
                 <w:sz w:val="19"/>
                 <w:szCs w:val="19"/>
@@ -2868,7 +3005,6 @@
           </w:tcPr>
           <w:p>
             <w:pPr>
-              <w:jc w:val="both"/>
               <w:rPr>
                 <w:sz w:val="19"/>
                 <w:szCs w:val="19"/>
@@ -2901,7 +3037,6 @@
           </w:tcPr>
           <w:p>
             <w:pPr>
-              <w:jc w:val="both"/>
               <w:rPr>
                 <w:sz w:val="19"/>
                 <w:szCs w:val="19"/>
@@ -2960,6 +3095,7 @@
                 <w:sz w:val="19"/>
                 <w:szCs w:val="19"/>
               </w:rPr>
+              <w:lastRenderedPageBreak/>
               <w:t>Join performance</w:t>
             </w:r>
           </w:p>
@@ -2982,7 +3118,6 @@
           </w:tcPr>
           <w:p>
             <w:pPr>
-              <w:jc w:val="both"/>
               <w:rPr>
                 <w:sz w:val="19"/>
                 <w:szCs w:val="19"/>
@@ -3015,7 +3150,6 @@
           </w:tcPr>
           <w:p>
             <w:pPr>
-              <w:jc w:val="both"/>
               <w:rPr>
                 <w:sz w:val="19"/>
                 <w:szCs w:val="19"/>
@@ -3048,7 +3182,6 @@
           </w:tcPr>
           <w:p>
             <w:pPr>
-              <w:jc w:val="both"/>
               <w:rPr>
                 <w:sz w:val="19"/>
                 <w:szCs w:val="19"/>
@@ -3120,7 +3253,6 @@
           </w:tcPr>
           <w:p>
             <w:pPr>
-              <w:jc w:val="both"/>
               <w:rPr>
                 <w:sz w:val="19"/>
                 <w:szCs w:val="19"/>
@@ -3153,7 +3285,6 @@
           </w:tcPr>
           <w:p>
             <w:pPr>
-              <w:jc w:val="both"/>
               <w:rPr>
                 <w:sz w:val="19"/>
                 <w:szCs w:val="19"/>
@@ -3186,7 +3317,6 @@
           </w:tcPr>
           <w:p>
             <w:pPr>
-              <w:jc w:val="both"/>
               <w:rPr>
                 <w:sz w:val="19"/>
                 <w:szCs w:val="19"/>
@@ -3258,7 +3388,6 @@
           </w:tcPr>
           <w:p>
             <w:pPr>
-              <w:jc w:val="both"/>
               <w:rPr>
                 <w:sz w:val="19"/>
                 <w:szCs w:val="19"/>
@@ -3291,7 +3420,6 @@
           </w:tcPr>
           <w:p>
             <w:pPr>
-              <w:jc w:val="both"/>
               <w:rPr>
                 <w:sz w:val="19"/>
                 <w:szCs w:val="19"/>
@@ -3324,7 +3452,6 @@
           </w:tcPr>
           <w:p>
             <w:pPr>
-              <w:jc w:val="both"/>
               <w:rPr>
                 <w:sz w:val="19"/>
                 <w:szCs w:val="19"/>
@@ -3380,23 +3507,29 @@
       </w:r>
     </w:p>
     <w:p>
-      <w:pPr>
-        <w:pStyle w:val="2"/>
-        <w:jc w:val="both"/>
-      </w:pPr>
-      <w:bookmarkStart w:id="22" w:name="_zbrc95u3zx4c" w:colFirst="0" w:colLast="0"/>
-      <w:bookmarkEnd w:id="22"/>
-      <w:r>
-        <w:lastRenderedPageBreak/>
+      <w:bookmarkStart w:id="20" w:name="_zbrc95u3zx4c" w:colFirst="0" w:colLast="0"/>
+      <w:bookmarkEnd w:id="20"/>
+    </w:p>
+    <w:p>
+      <w:r>
+        <w:t>Each system is best suited for different use cases. PostgreSQL with Apache AGE is well-suited for hybrid workloads that require both structured relational queries and graph traversal, such as fraud detection, recommendation systems, and network analysis. MySQL is ideal for high-performance transactional systems with well-defined schemas, such as banking systems or e-commerce platforms that prioritize consistency and speed. MongoDB is better suited for applications with flexible or evolving schemas, such as user-generated content, logging systems, or real-time analytics pipelines where scalability and schema flexibility are more important than strict relational integrity.</w:t>
+      </w:r>
+    </w:p>
+    <w:p>
+      <w:pPr>
+        <w:pStyle w:val="Heading2"/>
+        <w:jc w:val="both"/>
+      </w:pPr>
+      <w:r>
         <w:t>Limitations &amp; Lessons Learned</w:t>
       </w:r>
     </w:p>
     <w:p>
       <w:pPr>
-        <w:pStyle w:val="3"/>
-      </w:pPr>
-      <w:bookmarkStart w:id="23" w:name="_5kfll33pevvr" w:colFirst="0" w:colLast="0"/>
-      <w:bookmarkEnd w:id="23"/>
+        <w:pStyle w:val="Heading3"/>
+      </w:pPr>
+      <w:bookmarkStart w:id="21" w:name="_5kfll33pevvr" w:colFirst="0" w:colLast="0"/>
+      <w:bookmarkEnd w:id="21"/>
       <w:r>
         <w:t>Limitations</w:t>
       </w:r>
@@ -3447,10 +3580,10 @@
     </w:p>
     <w:p>
       <w:pPr>
-        <w:pStyle w:val="3"/>
-      </w:pPr>
-      <w:bookmarkStart w:id="24" w:name="_l9g75yjk2fk3" w:colFirst="0" w:colLast="0"/>
-      <w:bookmarkEnd w:id="24"/>
+        <w:pStyle w:val="Heading3"/>
+      </w:pPr>
+      <w:bookmarkStart w:id="22" w:name="_l9g75yjk2fk3" w:colFirst="0" w:colLast="0"/>
+      <w:bookmarkEnd w:id="22"/>
       <w:r>
         <w:t>Lessons Learned</w:t>
       </w:r>
@@ -3463,15 +3596,10 @@
         </w:numPr>
       </w:pPr>
       <w:r>
-        <w:t xml:space="preserve">One stack can support both workloads, but the graph layer has a measurable cost. The graph path is 5.7x slower for smurfing and 5.4x slower for cycle detection using the </w:t>
-      </w:r>
-      <w:proofErr w:type="gramStart"/>
-      <w:r>
-        <w:t>baseline</w:t>
-      </w:r>
-      <w:proofErr w:type="gramEnd"/>
-      <w:r>
-        <w:t xml:space="preserve"> Cypher. The overhead is concrete: </w:t>
+        <w:t xml:space="preserve">One stack can support both workloads, but the graph layer has a measurable cost. </w:t>
+      </w:r>
+      <w:r>
+        <w:t xml:space="preserve">The graph path is significantly slower due to </w:t>
       </w:r>
       <w:proofErr w:type="spellStart"/>
       <w:r>
@@ -3479,15 +3607,7 @@
       </w:r>
       <w:proofErr w:type="spellEnd"/>
       <w:r>
-        <w:t xml:space="preserve"> extraction on every row, extra vertex </w:t>
-      </w:r>
-      <w:proofErr w:type="gramStart"/>
-      <w:r>
-        <w:t>join</w:t>
-      </w:r>
-      <w:proofErr w:type="gramEnd"/>
-      <w:r>
-        <w:t xml:space="preserve"> steps, and repeated index-driven traversal instead of in-memory CTE materialization.</w:t>
+        <w:t xml:space="preserve"> extraction, additional vertex joins, and repeated index-driven traversal.</w:t>
       </w:r>
     </w:p>
     <w:p>
@@ -3528,7 +3648,11 @@
         </w:numPr>
       </w:pPr>
       <w:r>
-        <w:t xml:space="preserve">Physical storage format determines performance more than query language. Cypher is more concise than recursive SQL, but conciseness does not translate to faster execution when storage requires a </w:t>
+        <w:t xml:space="preserve">Physical storage format determines performance more than query language. Cypher is more concise than recursive SQL, but conciseness does not translate to faster execution when storage </w:t>
+      </w:r>
+      <w:r>
+        <w:lastRenderedPageBreak/>
+        <w:t xml:space="preserve">requires a </w:t>
       </w:r>
       <w:proofErr w:type="gramStart"/>
       <w:r>
@@ -3539,13 +3663,19 @@
         <w:t xml:space="preserve"> extraction and B-tree traversal on every hop. A more expressive query language does not guarantee a more efficient execution plan.</w:t>
       </w:r>
     </w:p>
-    <w:p>
-      <w:pPr>
-        <w:pStyle w:val="2"/>
-        <w:jc w:val="both"/>
-      </w:pPr>
-      <w:bookmarkStart w:id="25" w:name="_je5e7aaov5nk" w:colFirst="0" w:colLast="0"/>
-      <w:bookmarkEnd w:id="25"/>
+    <w:p/>
+    <w:p>
+      <w:r>
+        <w:t>From a project perspective, one key insight was that system design decisions—such as storage format, indexing strategy, and execution model—often have a greater impact on performance than the choice of query language itself. We initially expected graph queries to outperform relational approaches for traversal-heavy workloads, but the results showed that this assumption does not always hold, especially for bounded-depth patterns on moderate datasets. This experience highlighted the importance of empirical evaluation using tools like EXPLAIN ANALYZE, rather than relying solely on theoretical advantages of a given system.</w:t>
+      </w:r>
+    </w:p>
+    <w:p>
+      <w:pPr>
+        <w:pStyle w:val="Heading2"/>
+        <w:jc w:val="both"/>
+      </w:pPr>
+      <w:bookmarkStart w:id="23" w:name="_je5e7aaov5nk" w:colFirst="0" w:colLast="0"/>
+      <w:bookmarkEnd w:id="23"/>
       <w:r>
         <w:t>Project Links</w:t>
       </w:r>
@@ -3562,12 +3692,12 @@
       <w:r>
         <w:t>GitHub Repository:</w:t>
       </w:r>
-      <w:hyperlink r:id="rId11">
+      <w:hyperlink r:id="rId12">
         <w:r>
           <w:t xml:space="preserve"> </w:t>
         </w:r>
       </w:hyperlink>
-      <w:hyperlink r:id="rId12">
+      <w:hyperlink r:id="rId13">
         <w:r>
           <w:rPr>
             <w:color w:val="1155CC"/>
@@ -3581,9 +3711,6 @@
       <w:pPr>
         <w:spacing w:before="60" w:after="60"/>
         <w:jc w:val="both"/>
-        <w:rPr>
-          <w:rFonts w:hint="eastAsia"/>
-        </w:rPr>
       </w:pPr>
       <w:r>
         <w:t>The repository contains the source code, schema, setup scripts, synthetic data generator, detection queries, benchmark scripts, EXPLAIN ANALYZE artifacts, and documentation. Key paths include README.md for setup, scripts/reset_pipeline.sh for one-command setup, scripts/run_demo_queries.sh for detections</w:t>
@@ -3597,7 +3724,7 @@
     </w:p>
     <w:sectPr>
       <w:pgSz w:w="12240" w:h="15840"/>
-      <w:pgMar w:top="1440" w:right="1440" w:bottom="1440" w:left="1440" w:header="720" w:footer="720" w:gutter="0"/>
+      <w:pgMar w:top="630" w:right="1440" w:bottom="900" w:left="1440" w:header="720" w:footer="720" w:gutter="0"/>
       <w:pgNumType w:start="1"/>
       <w:cols w:space="720"/>
     </w:sectPr>
@@ -4237,14 +4364,15 @@
     <w:lsdException w:name="Unresolved Mention" w:semiHidden="1" w:unhideWhenUsed="1"/>
     <w:lsdException w:name="Smart Link" w:semiHidden="1" w:unhideWhenUsed="1"/>
   </w:latentStyles>
-  <w:style w:type="paragraph" w:default="1" w:styleId="a">
+  <w:style w:type="paragraph" w:default="1" w:styleId="Normal">
     <w:name w:val="Normal"/>
     <w:qFormat/>
+    <w:rsid w:val="00471BA9"/>
   </w:style>
-  <w:style w:type="paragraph" w:styleId="1">
+  <w:style w:type="paragraph" w:styleId="Heading1">
     <w:name w:val="heading 1"/>
-    <w:basedOn w:val="a"/>
-    <w:next w:val="a"/>
+    <w:basedOn w:val="Normal"/>
+    <w:next w:val="Normal"/>
     <w:uiPriority w:val="9"/>
     <w:qFormat/>
     <w:pPr>
@@ -4262,10 +4390,10 @@
       <w:szCs w:val="36"/>
     </w:rPr>
   </w:style>
-  <w:style w:type="paragraph" w:styleId="2">
+  <w:style w:type="paragraph" w:styleId="Heading2">
     <w:name w:val="heading 2"/>
-    <w:basedOn w:val="a"/>
-    <w:next w:val="a"/>
+    <w:basedOn w:val="Normal"/>
+    <w:next w:val="Normal"/>
     <w:uiPriority w:val="9"/>
     <w:unhideWhenUsed/>
     <w:qFormat/>
@@ -4280,10 +4408,10 @@
       <w:szCs w:val="32"/>
     </w:rPr>
   </w:style>
-  <w:style w:type="paragraph" w:styleId="3">
+  <w:style w:type="paragraph" w:styleId="Heading3">
     <w:name w:val="heading 3"/>
-    <w:basedOn w:val="a"/>
-    <w:next w:val="a"/>
+    <w:basedOn w:val="Normal"/>
+    <w:next w:val="Normal"/>
     <w:uiPriority w:val="9"/>
     <w:unhideWhenUsed/>
     <w:qFormat/>
@@ -4299,10 +4427,10 @@
       <w:szCs w:val="28"/>
     </w:rPr>
   </w:style>
-  <w:style w:type="paragraph" w:styleId="4">
+  <w:style w:type="paragraph" w:styleId="Heading4">
     <w:name w:val="heading 4"/>
-    <w:basedOn w:val="a"/>
-    <w:next w:val="a"/>
+    <w:basedOn w:val="Normal"/>
+    <w:next w:val="Normal"/>
     <w:uiPriority w:val="9"/>
     <w:semiHidden/>
     <w:unhideWhenUsed/>
@@ -4319,10 +4447,10 @@
       <w:szCs w:val="24"/>
     </w:rPr>
   </w:style>
-  <w:style w:type="paragraph" w:styleId="5">
+  <w:style w:type="paragraph" w:styleId="Heading5">
     <w:name w:val="heading 5"/>
-    <w:basedOn w:val="a"/>
-    <w:next w:val="a"/>
+    <w:basedOn w:val="Normal"/>
+    <w:next w:val="Normal"/>
     <w:uiPriority w:val="9"/>
     <w:semiHidden/>
     <w:unhideWhenUsed/>
@@ -4337,10 +4465,10 @@
       <w:color w:val="666666"/>
     </w:rPr>
   </w:style>
-  <w:style w:type="paragraph" w:styleId="6">
+  <w:style w:type="paragraph" w:styleId="Heading6">
     <w:name w:val="heading 6"/>
-    <w:basedOn w:val="a"/>
-    <w:next w:val="a"/>
+    <w:basedOn w:val="Normal"/>
+    <w:next w:val="Normal"/>
     <w:uiPriority w:val="9"/>
     <w:semiHidden/>
     <w:unhideWhenUsed/>
@@ -4357,13 +4485,12 @@
       <w:color w:val="666666"/>
     </w:rPr>
   </w:style>
-  <w:style w:type="character" w:default="1" w:styleId="a0">
+  <w:style w:type="character" w:default="1" w:styleId="DefaultParagraphFont">
     <w:name w:val="Default Paragraph Font"/>
     <w:uiPriority w:val="1"/>
-    <w:semiHidden/>
     <w:unhideWhenUsed/>
   </w:style>
-  <w:style w:type="table" w:default="1" w:styleId="a1">
+  <w:style w:type="table" w:default="1" w:styleId="TableNormal">
     <w:name w:val="Normal Table"/>
     <w:uiPriority w:val="99"/>
     <w:semiHidden/>
@@ -4378,13 +4505,13 @@
       </w:tblCellMar>
     </w:tblPr>
   </w:style>
-  <w:style w:type="numbering" w:default="1" w:styleId="a2">
+  <w:style w:type="numbering" w:default="1" w:styleId="NoList">
     <w:name w:val="No List"/>
     <w:uiPriority w:val="99"/>
     <w:semiHidden/>
     <w:unhideWhenUsed/>
   </w:style>
-  <w:style w:type="table" w:customStyle="1" w:styleId="TableNormal">
+  <w:style w:type="table" w:customStyle="1" w:styleId="TableNormal0">
     <w:name w:val="TableNormal"/>
     <w:tblPr>
       <w:tblCellMar>
@@ -4395,10 +4522,10 @@
       </w:tblCellMar>
     </w:tblPr>
   </w:style>
-  <w:style w:type="paragraph" w:styleId="a3">
+  <w:style w:type="paragraph" w:styleId="Title">
     <w:name w:val="Title"/>
-    <w:basedOn w:val="a"/>
-    <w:next w:val="a"/>
+    <w:basedOn w:val="Normal"/>
+    <w:next w:val="Normal"/>
     <w:uiPriority w:val="10"/>
     <w:qFormat/>
     <w:pPr>
@@ -4411,10 +4538,10 @@
       <w:szCs w:val="52"/>
     </w:rPr>
   </w:style>
-  <w:style w:type="paragraph" w:styleId="a4">
+  <w:style w:type="paragraph" w:styleId="Subtitle">
     <w:name w:val="Subtitle"/>
-    <w:basedOn w:val="a"/>
-    <w:next w:val="a"/>
+    <w:basedOn w:val="Normal"/>
+    <w:next w:val="Normal"/>
     <w:uiPriority w:val="11"/>
     <w:qFormat/>
     <w:pPr>
@@ -4429,15 +4556,15 @@
       <w:szCs w:val="30"/>
     </w:rPr>
   </w:style>
-  <w:style w:type="table" w:customStyle="1" w:styleId="a5">
-    <w:basedOn w:val="TableNormal"/>
+  <w:style w:type="table" w:customStyle="1" w:styleId="a">
+    <w:basedOn w:val="TableNormal0"/>
     <w:tblPr>
       <w:tblStyleRowBandSize w:val="1"/>
       <w:tblStyleColBandSize w:val="1"/>
     </w:tblPr>
   </w:style>
-  <w:style w:type="table" w:customStyle="1" w:styleId="a6">
-    <w:basedOn w:val="TableNormal"/>
+  <w:style w:type="table" w:customStyle="1" w:styleId="a0">
+    <w:basedOn w:val="TableNormal0"/>
     <w:tblPr>
       <w:tblStyleRowBandSize w:val="1"/>
       <w:tblStyleColBandSize w:val="1"/>

</xml_diff>